<commit_message>
Update docxs, fix logic bugs & typos, cosmetic changes
</commit_message>
<xml_diff>
--- a/docassemble/AkPowerOfAttorneyOverAMinorByParentOrGuardian/data/templates/ak_power_of_attorney_over_a_minor_by_parent_or_guardian.docx
+++ b/docassemble/AkPowerOfAttorneyOverAMinorByParentOrGuardian/data/templates/ak_power_of_attorney_over_a_minor_by_parent_or_guardian.docx
@@ -1128,7 +1128,88 @@
           <w:rtl w:val="0"/>
           <w:lang w:val="en-US"/>
         </w:rPr>
+        <w:t xml:space="preserve">{%- if  </w:t>
+      </w:r>
+      <w:r>
+        <w:rPr>
+          <w:sz w:val="24"/>
+          <w:szCs w:val="24"/>
+          <w:rtl w:val="0"/>
+          <w:lang w:val="en-US"/>
+        </w:rPr>
+        <w:t>parental_delegation_mandates</w:t>
+      </w:r>
+      <w:r>
+        <w:rPr>
+          <w:sz w:val="24"/>
+          <w:szCs w:val="24"/>
+          <w:rtl w:val="0"/>
+          <w:lang w:val="en-US"/>
+        </w:rPr>
+        <w:t xml:space="preserve">[ </w:t>
+      </w:r>
+      <w:r>
+        <w:rPr>
+          <w:sz w:val="24"/>
+          <w:szCs w:val="24"/>
+          <w:rtl w:val="0"/>
+          <w:lang w:val="en-US"/>
+        </w:rPr>
+        <w:t>“</w:t>
+      </w:r>
+      <w:r>
+        <w:rPr>
+          <w:sz w:val="24"/>
+          <w:szCs w:val="24"/>
+          <w:rtl w:val="0"/>
+          <w:lang w:val="en-US"/>
+        </w:rPr>
+        <w:t>other"</w:t>
+      </w:r>
+      <w:r>
+        <w:rPr>
+          <w:sz w:val="24"/>
+          <w:szCs w:val="24"/>
+          <w:rtl w:val="0"/>
+          <w:lang w:val="en-US"/>
+        </w:rPr>
+        <w:t xml:space="preserve"> ] %}</w:t>
+      </w:r>
+    </w:p>
+    <w:p>
+      <w:pPr>
+        <w:pStyle w:val="Body"/>
+        <w:rPr>
+          <w:sz w:val="24"/>
+          <w:szCs w:val="24"/>
+        </w:rPr>
+      </w:pPr>
+      <w:r>
+        <w:rPr>
+          <w:sz w:val="24"/>
+          <w:szCs w:val="24"/>
+          <w:rtl w:val="0"/>
+          <w:lang w:val="en-US"/>
+        </w:rPr>
         <w:t>Also: {{ custom_mandates }}</w:t>
+      </w:r>
+    </w:p>
+    <w:p>
+      <w:pPr>
+        <w:pStyle w:val="Body"/>
+        <w:rPr>
+          <w:sz w:val="24"/>
+          <w:szCs w:val="24"/>
+        </w:rPr>
+      </w:pPr>
+      <w:r>
+        <w:rPr>
+          <w:sz w:val="24"/>
+          <w:szCs w:val="24"/>
+          <w:rtl w:val="0"/>
+          <w:lang w:val="en-US"/>
+        </w:rPr>
+        <w:t>{%- endif %}</w:t>
       </w:r>
     </w:p>
     <w:p>
@@ -1742,7 +1823,7 @@
           <w:shd w:val="clear" w:color="auto" w:fill="auto"/>
         </w:tblPrEx>
         <w:trPr>
-          <w:trHeight w:val="1123" w:hRule="atLeast"/>
+          <w:trHeight w:val="1683" w:hRule="atLeast"/>
         </w:trPr>
         <w:tc>
           <w:tcPr>
@@ -1825,7 +1906,7 @@
                 <w:rFonts w:ascii="Helvetica Neue" w:cs="Arial Unicode MS" w:hAnsi="Helvetica Neue" w:eastAsia="Arial Unicode MS"/>
                 <w:rtl w:val="0"/>
               </w:rPr>
-              <w:t>{{ users[0].mobile_number or users[0].phone_number }}</w:t>
+              <w:t>{{ showifdef("users[0].mobile_number") or showifdef("users[0].phone_number") }}</w:t>
             </w:r>
           </w:p>
         </w:tc>
@@ -2194,9 +2275,9 @@
         <w:tblLayout w:type="fixed"/>
       </w:tblPr>
       <w:tblGrid>
-        <w:gridCol w:w="4466"/>
-        <w:gridCol w:w="2771"/>
-        <w:gridCol w:w="2113"/>
+        <w:gridCol w:w="4405"/>
+        <w:gridCol w:w="2891"/>
+        <w:gridCol w:w="2054"/>
       </w:tblGrid>
       <w:tr>
         <w:tblPrEx>
@@ -2207,7 +2288,7 @@
         </w:trPr>
         <w:tc>
           <w:tcPr>
-            <w:tcW w:type="dxa" w:w="4466"/>
+            <w:tcW w:type="dxa" w:w="4405"/>
             <w:tcBorders>
               <w:top w:val="nil"/>
               <w:left w:val="nil"/>
@@ -2241,7 +2322,7 @@
         </w:tc>
         <w:tc>
           <w:tcPr>
-            <w:tcW w:type="dxa" w:w="4883"/>
+            <w:tcW w:type="dxa" w:w="4944"/>
             <w:gridSpan w:val="2"/>
             <w:tcBorders>
               <w:top w:val="nil"/>
@@ -2290,7 +2371,7 @@
         </w:trPr>
         <w:tc>
           <w:tcPr>
-            <w:tcW w:type="dxa" w:w="4466"/>
+            <w:tcW w:type="dxa" w:w="4405"/>
             <w:tcBorders>
               <w:top w:val="nil"/>
               <w:left w:val="nil"/>
@@ -2310,7 +2391,7 @@
         </w:tc>
         <w:tc>
           <w:tcPr>
-            <w:tcW w:type="dxa" w:w="2771"/>
+            <w:tcW w:type="dxa" w:w="2890"/>
             <w:tcBorders>
               <w:top w:val="nil"/>
               <w:left w:val="nil"/>
@@ -2319,12 +2400,12 @@
             </w:tcBorders>
             <w:shd w:val="clear" w:color="auto" w:fill="auto"/>
             <w:tcMar>
-              <w:top w:type="dxa" w:w="80"/>
-              <w:left w:type="dxa" w:w="80"/>
-              <w:bottom w:type="dxa" w:w="80"/>
-              <w:right w:type="dxa" w:w="80"/>
+              <w:top w:type="dxa" w:w="0"/>
+              <w:left w:type="dxa" w:w="0"/>
+              <w:bottom w:type="dxa" w:w="0"/>
+              <w:right w:type="dxa" w:w="0"/>
             </w:tcMar>
-            <w:vAlign w:val="top"/>
+            <w:vAlign w:val="bottom"/>
           </w:tcPr>
           <w:p>
             <w:pPr>
@@ -2343,7 +2424,7 @@
         </w:tc>
         <w:tc>
           <w:tcPr>
-            <w:tcW w:type="dxa" w:w="2112"/>
+            <w:tcW w:type="dxa" w:w="2053"/>
             <w:tcBorders>
               <w:top w:val="nil"/>
               <w:left w:val="nil"/>
@@ -2371,7 +2452,7 @@
         </w:trPr>
         <w:tc>
           <w:tcPr>
-            <w:tcW w:type="dxa" w:w="7237"/>
+            <w:tcW w:type="dxa" w:w="7296"/>
             <w:gridSpan w:val="2"/>
             <w:tcBorders>
               <w:top w:val="nil"/>
@@ -2392,7 +2473,7 @@
         </w:tc>
         <w:tc>
           <w:tcPr>
-            <w:tcW w:type="dxa" w:w="2112"/>
+            <w:tcW w:type="dxa" w:w="2053"/>
             <w:tcBorders>
               <w:top w:val="nil"/>
               <w:left w:val="nil"/>
@@ -2658,7 +2739,7 @@
           <w:shd w:val="clear" w:color="auto" w:fill="auto"/>
         </w:tblPrEx>
         <w:trPr>
-          <w:trHeight w:val="1123" w:hRule="atLeast"/>
+          <w:trHeight w:val="1683" w:hRule="atLeast"/>
         </w:trPr>
         <w:tc>
           <w:tcPr>
@@ -2741,7 +2822,7 @@
                 <w:rFonts w:ascii="Helvetica Neue" w:cs="Arial Unicode MS" w:hAnsi="Helvetica Neue" w:eastAsia="Arial Unicode MS"/>
                 <w:rtl w:val="0"/>
               </w:rPr>
-              <w:t>{{ caregivers[0].mobile_number or caregivers[0].phone_number }}</w:t>
+              <w:t>{{ showifdef("caregivers[0].mobile_number") or showifdef("caregivers[0].phone_number") }}</w:t>
             </w:r>
           </w:p>
         </w:tc>
@@ -3025,9 +3106,9 @@
         <w:tblLayout w:type="fixed"/>
       </w:tblPr>
       <w:tblGrid>
-        <w:gridCol w:w="4466"/>
-        <w:gridCol w:w="2771"/>
-        <w:gridCol w:w="2113"/>
+        <w:gridCol w:w="4405"/>
+        <w:gridCol w:w="2891"/>
+        <w:gridCol w:w="2054"/>
       </w:tblGrid>
       <w:tr>
         <w:tblPrEx>
@@ -3038,7 +3119,7 @@
         </w:trPr>
         <w:tc>
           <w:tcPr>
-            <w:tcW w:type="dxa" w:w="4466"/>
+            <w:tcW w:type="dxa" w:w="4405"/>
             <w:tcBorders>
               <w:top w:val="nil"/>
               <w:left w:val="nil"/>
@@ -3072,7 +3153,7 @@
         </w:tc>
         <w:tc>
           <w:tcPr>
-            <w:tcW w:type="dxa" w:w="4883"/>
+            <w:tcW w:type="dxa" w:w="4944"/>
             <w:gridSpan w:val="2"/>
             <w:tcBorders>
               <w:top w:val="nil"/>
@@ -3121,7 +3202,7 @@
         </w:trPr>
         <w:tc>
           <w:tcPr>
-            <w:tcW w:type="dxa" w:w="4466"/>
+            <w:tcW w:type="dxa" w:w="4405"/>
             <w:tcBorders>
               <w:top w:val="nil"/>
               <w:left w:val="nil"/>
@@ -3141,7 +3222,7 @@
         </w:tc>
         <w:tc>
           <w:tcPr>
-            <w:tcW w:type="dxa" w:w="2771"/>
+            <w:tcW w:type="dxa" w:w="2890"/>
             <w:tcBorders>
               <w:top w:val="nil"/>
               <w:left w:val="nil"/>
@@ -3150,12 +3231,12 @@
             </w:tcBorders>
             <w:shd w:val="clear" w:color="auto" w:fill="auto"/>
             <w:tcMar>
-              <w:top w:type="dxa" w:w="80"/>
-              <w:left w:type="dxa" w:w="80"/>
-              <w:bottom w:type="dxa" w:w="80"/>
-              <w:right w:type="dxa" w:w="80"/>
+              <w:top w:type="dxa" w:w="0"/>
+              <w:left w:type="dxa" w:w="0"/>
+              <w:bottom w:type="dxa" w:w="0"/>
+              <w:right w:type="dxa" w:w="0"/>
             </w:tcMar>
-            <w:vAlign w:val="top"/>
+            <w:vAlign w:val="bottom"/>
           </w:tcPr>
           <w:p>
             <w:pPr>
@@ -3174,7 +3255,7 @@
         </w:tc>
         <w:tc>
           <w:tcPr>
-            <w:tcW w:type="dxa" w:w="2112"/>
+            <w:tcW w:type="dxa" w:w="2053"/>
             <w:tcBorders>
               <w:top w:val="nil"/>
               <w:left w:val="nil"/>
@@ -3202,7 +3283,7 @@
         </w:trPr>
         <w:tc>
           <w:tcPr>
-            <w:tcW w:type="dxa" w:w="7237"/>
+            <w:tcW w:type="dxa" w:w="7296"/>
             <w:gridSpan w:val="2"/>
             <w:tcBorders>
               <w:top w:val="nil"/>
@@ -3223,7 +3304,7 @@
         </w:tc>
         <w:tc>
           <w:tcPr>
-            <w:tcW w:type="dxa" w:w="2112"/>
+            <w:tcW w:type="dxa" w:w="2053"/>
             <w:tcBorders>
               <w:top w:val="nil"/>
               <w:left w:val="nil"/>

</xml_diff>